<commit_message>
Archivo de entrega terminado
</commit_message>
<xml_diff>
--- a/Optimización empresarial y segmentación de clientes.docx
+++ b/Optimización empresarial y segmentación de clientes.docx
@@ -5,15 +5,21 @@
     <w:p>
       <w:pPr>
         <w:rPr>
+          <w:rFonts w:ascii="Times New Roman" w:hAnsi="Times New Roman" w:cs="Times New Roman"/>
           <w:b/>
           <w:bCs/>
+          <w:sz w:val="24"/>
+          <w:szCs w:val="24"/>
           <w:lang w:val="es-ES"/>
         </w:rPr>
       </w:pPr>
       <w:r>
         <w:rPr>
+          <w:rFonts w:ascii="Times New Roman" w:hAnsi="Times New Roman" w:cs="Times New Roman"/>
           <w:b/>
           <w:bCs/>
+          <w:sz w:val="24"/>
+          <w:szCs w:val="24"/>
           <w:lang w:val="es-ES"/>
         </w:rPr>
         <w:t>Optimización empresarial y segmentación de clientes</w:t>
@@ -117,19 +123,41 @@
         <w:t>Ticket Promedio ($18,41 por transacción): indica cuánto gasta un cliente en cada visita. Tasa de Rotación de Inventario (48% promedio): identifica qué productos están en riesgo de agotarse o de acumularse en exceso.</w:t>
       </w:r>
     </w:p>
-    <w:p/>
-    <w:p/>
-    <w:p>
-      <w:pPr>
-        <w:rPr>
+    <w:p>
+      <w:pPr>
+        <w:rPr>
+          <w:rFonts w:ascii="Times New Roman" w:hAnsi="Times New Roman" w:cs="Times New Roman"/>
+          <w:sz w:val="24"/>
+          <w:szCs w:val="24"/>
+        </w:rPr>
+      </w:pPr>
+    </w:p>
+    <w:p>
+      <w:pPr>
+        <w:rPr>
+          <w:rFonts w:ascii="Times New Roman" w:hAnsi="Times New Roman" w:cs="Times New Roman"/>
+          <w:sz w:val="24"/>
+          <w:szCs w:val="24"/>
+        </w:rPr>
+      </w:pPr>
+    </w:p>
+    <w:p>
+      <w:pPr>
+        <w:rPr>
+          <w:rFonts w:ascii="Times New Roman" w:hAnsi="Times New Roman" w:cs="Times New Roman"/>
           <w:b/>
           <w:bCs/>
-        </w:rPr>
-      </w:pPr>
-      <w:r>
-        <w:rPr>
+          <w:sz w:val="24"/>
+          <w:szCs w:val="24"/>
+        </w:rPr>
+      </w:pPr>
+      <w:r>
+        <w:rPr>
+          <w:rFonts w:ascii="Times New Roman" w:hAnsi="Times New Roman" w:cs="Times New Roman"/>
           <w:b/>
           <w:bCs/>
+          <w:sz w:val="24"/>
+          <w:szCs w:val="24"/>
         </w:rPr>
         <w:t>Fase 2. Preparación de los datos (ETL)</w:t>
       </w:r>
@@ -139,19 +167,11 @@
         <w:pStyle w:val="font-claude-response-body"/>
       </w:pPr>
       <w:r>
-        <w:t xml:space="preserve">El proceso ETL se realizó en Python </w:t>
-      </w:r>
-      <w:r>
-        <w:t xml:space="preserve">con pandas. </w:t>
-      </w:r>
-      <w:r>
-        <w:t xml:space="preserve">A </w:t>
-      </w:r>
-      <w:proofErr w:type="gramStart"/>
-      <w:r>
-        <w:t>continuación</w:t>
-      </w:r>
-      <w:proofErr w:type="gramEnd"/>
+        <w:t>El proceso ETL se realizó en Python con pandas. A continuación</w:t>
+      </w:r>
+      <w:r>
+        <w:t>,</w:t>
+      </w:r>
       <w:r>
         <w:t xml:space="preserve"> se describen los pasos seguidos y los hallazgos relevantes.</w:t>
       </w:r>
@@ -160,10 +180,16 @@
       <w:pPr>
         <w:pStyle w:val="font-claude-response-body"/>
       </w:pPr>
+    </w:p>
+    <w:p>
+      <w:pPr>
+        <w:pStyle w:val="font-claude-response-body"/>
+      </w:pPr>
       <w:r>
         <w:rPr>
           <w:rStyle w:val="Textoennegrita"/>
         </w:rPr>
+        <w:lastRenderedPageBreak/>
         <w:t>Limpieza y validación</w:t>
       </w:r>
     </w:p>
@@ -172,7 +198,6 @@
         <w:pStyle w:val="font-claude-response-body"/>
       </w:pPr>
       <w:r>
-        <w:lastRenderedPageBreak/>
         <w:t xml:space="preserve">No se encontraron valores nulos en ninguna hoja. En duplicados, Ventas e Inventario estaban limpias, pero Clientes tenía 1 registro duplicado que fue eliminado. Los tipos de dato eran correctos: fechas en </w:t>
       </w:r>
       <w:proofErr w:type="spellStart"/>
@@ -246,9 +271,73 @@
     <w:p>
       <w:pPr>
         <w:pStyle w:val="font-claude-response-body"/>
-      </w:pPr>
-      <w:r>
-        <w:t>Ventas Totales = Cantidad Vendida × Precio → $1.472,50 en el período. Ticket Promedio = promedio del valor por transacción → $18,41. Unidades Vendidas = suma total → 793 unidades. Frecuencia de Compra Promedio = 5,81 compras por cliente. Tasa de Rotación de Inventario = (Stock Inicial − Stock Final) / Stock Inicial × 100 → 48% promedio.</w:t>
+        <w:numPr>
+          <w:ilvl w:val="0"/>
+          <w:numId w:val="1"/>
+        </w:numPr>
+      </w:pPr>
+      <w:r>
+        <w:t>Ventas Totales = Cantidad Vendida × Precio</w:t>
+      </w:r>
+      <w:r>
+        <w:t>:</w:t>
+      </w:r>
+      <w:r>
+        <w:t xml:space="preserve"> $1.472,50 en el período. </w:t>
+      </w:r>
+    </w:p>
+    <w:p>
+      <w:pPr>
+        <w:pStyle w:val="font-claude-response-body"/>
+        <w:numPr>
+          <w:ilvl w:val="0"/>
+          <w:numId w:val="1"/>
+        </w:numPr>
+      </w:pPr>
+      <w:r>
+        <w:t>Ticket Promedio = promedio del valor por transacción</w:t>
+      </w:r>
+      <w:r>
+        <w:t>:</w:t>
+      </w:r>
+      <w:r>
+        <w:t xml:space="preserve"> $18,41. </w:t>
+      </w:r>
+    </w:p>
+    <w:p>
+      <w:pPr>
+        <w:pStyle w:val="font-claude-response-body"/>
+        <w:numPr>
+          <w:ilvl w:val="0"/>
+          <w:numId w:val="1"/>
+        </w:numPr>
+      </w:pPr>
+      <w:r>
+        <w:t>Unidades Vendidas = suma total</w:t>
+      </w:r>
+      <w:r>
+        <w:t>:</w:t>
+      </w:r>
+      <w:r>
+        <w:t xml:space="preserve"> 793 unidades. Frecuencia de Compra Promedio = 5,81 compras por cliente. </w:t>
+      </w:r>
+    </w:p>
+    <w:p>
+      <w:pPr>
+        <w:pStyle w:val="font-claude-response-body"/>
+        <w:numPr>
+          <w:ilvl w:val="0"/>
+          <w:numId w:val="1"/>
+        </w:numPr>
+      </w:pPr>
+      <w:r>
+        <w:t>Tasa de Rotación de Inventario = (Stock Inicial − Stock Final) / Stock Inicial × 100</w:t>
+      </w:r>
+      <w:r>
+        <w:t>:</w:t>
+      </w:r>
+      <w:r>
+        <w:t xml:space="preserve"> 48% promedio.</w:t>
       </w:r>
       <w:r>
         <w:br/>
@@ -403,6 +492,7 @@
           <w:szCs w:val="24"/>
           <w:lang w:eastAsia="es-CO"/>
         </w:rPr>
+        <w:lastRenderedPageBreak/>
         <w:t>La variable que más pesa en la clasificación es la frecuencia de compra (98,3% de importancia en el árbol), lo que confirma que fidelizar un cliente no depende tanto de su edad o género, sino de lograr que vuelva más seguido.</w:t>
       </w:r>
     </w:p>
@@ -425,7 +515,6 @@
           <w:szCs w:val="24"/>
           <w:lang w:eastAsia="es-CO"/>
         </w:rPr>
-        <w:lastRenderedPageBreak/>
         <w:t>Predicciones de demanda</w:t>
       </w:r>
     </w:p>
@@ -499,7 +588,27 @@
           <w:szCs w:val="24"/>
           <w:lang w:eastAsia="es-CO"/>
         </w:rPr>
-        <w:t xml:space="preserve"> Los productos 108, 104, 111, 112 y 103 presentan tasas de rotación superiores al 57% por período, con frecuencias de reabastecimiento trimestral o bimensual, lo que los pone en riesgo real de desabastecimiento. Se recomienda moverlos a reabastecimiento mensual y aumentar el stock inicial entre un 15% y 20%. Esto es especialmente urgente para el producto 104, que aparece dos veces con rotación del 59,1% en distintas frecuencias, indicando demanda sostenida.</w:t>
+        <w:t xml:space="preserve"> </w:t>
+      </w:r>
+    </w:p>
+    <w:p>
+      <w:pPr>
+        <w:spacing w:before="100" w:beforeAutospacing="1" w:after="100" w:afterAutospacing="1" w:line="240" w:lineRule="auto"/>
+        <w:rPr>
+          <w:rFonts w:ascii="Times New Roman" w:eastAsia="Times New Roman" w:hAnsi="Times New Roman" w:cs="Times New Roman"/>
+          <w:sz w:val="24"/>
+          <w:szCs w:val="24"/>
+          <w:lang w:eastAsia="es-CO"/>
+        </w:rPr>
+      </w:pPr>
+      <w:r>
+        <w:rPr>
+          <w:rFonts w:ascii="Times New Roman" w:eastAsia="Times New Roman" w:hAnsi="Times New Roman" w:cs="Times New Roman"/>
+          <w:sz w:val="24"/>
+          <w:szCs w:val="24"/>
+          <w:lang w:eastAsia="es-CO"/>
+        </w:rPr>
+        <w:t>Los productos 108, 104, 111, 112 y 103 presentan tasas de rotación superiores al 57% por período, con frecuencias de reabastecimiento trimestral o bimensual, lo que los pone en riesgo real de desabastecimiento. Se recomienda moverlos a reabastecimiento mensual y aumentar el stock inicial entre un 15% y 20%. Esto es especialmente urgente para el producto 104, que aparece dos veces con rotación del 59,1% en distintas frecuencias, indicando demanda sostenida.</w:t>
       </w:r>
     </w:p>
     <w:p>
@@ -544,33 +653,62 @@
         </w:rPr>
       </w:pPr>
       <w:r>
+        <w:rPr>
+          <w:rFonts w:ascii="Times New Roman" w:hAnsi="Times New Roman" w:cs="Times New Roman"/>
+          <w:sz w:val="24"/>
+          <w:szCs w:val="24"/>
+        </w:rPr>
         <w:t xml:space="preserve">Para </w:t>
       </w:r>
       <w:r>
         <w:rPr>
           <w:rStyle w:val="Textoennegrita"/>
+          <w:rFonts w:ascii="Times New Roman" w:hAnsi="Times New Roman" w:cs="Times New Roman"/>
+          <w:sz w:val="24"/>
+          <w:szCs w:val="24"/>
         </w:rPr>
         <w:t>Regulares</w:t>
       </w:r>
       <w:r>
+        <w:rPr>
+          <w:rFonts w:ascii="Times New Roman" w:hAnsi="Times New Roman" w:cs="Times New Roman"/>
+          <w:sz w:val="24"/>
+          <w:szCs w:val="24"/>
+        </w:rPr>
         <w:t xml:space="preserve">: cerrar la brecha de 4,4 compras que los separa de los Leales. Si el 50% aumenta su frecuencia en 2 visitas, el ingreso adicional potencial es de $534. Se sugiere un programa de puntos o descuento progresivo. Para </w:t>
       </w:r>
       <w:r>
         <w:rPr>
           <w:rStyle w:val="Textoennegrita"/>
+          <w:rFonts w:ascii="Times New Roman" w:hAnsi="Times New Roman" w:cs="Times New Roman"/>
+          <w:sz w:val="24"/>
+          <w:szCs w:val="24"/>
         </w:rPr>
         <w:t>Nuevos</w:t>
       </w:r>
       <w:r>
+        <w:rPr>
+          <w:rFonts w:ascii="Times New Roman" w:hAnsi="Times New Roman" w:cs="Times New Roman"/>
+          <w:sz w:val="24"/>
+          <w:szCs w:val="24"/>
+        </w:rPr>
         <w:t xml:space="preserve">: aprovechar su perfil joven y femenino con canales digitales, promociones de primera compra y combos de productos básicos. Para </w:t>
       </w:r>
       <w:r>
         <w:rPr>
           <w:rStyle w:val="Textoennegrita"/>
+          <w:rFonts w:ascii="Times New Roman" w:hAnsi="Times New Roman" w:cs="Times New Roman"/>
+          <w:sz w:val="24"/>
+          <w:szCs w:val="24"/>
         </w:rPr>
         <w:t>Leales</w:t>
       </w:r>
       <w:r>
+        <w:rPr>
+          <w:rFonts w:ascii="Times New Roman" w:hAnsi="Times New Roman" w:cs="Times New Roman"/>
+          <w:sz w:val="24"/>
+          <w:szCs w:val="24"/>
+        </w:rPr>
         <w:t>: no atraerlos sino retenerlos con acceso anticipado a promociones y beneficios exclusivos.</w:t>
       </w:r>
     </w:p>
@@ -604,63 +742,182 @@
         </w:rPr>
         <w:t xml:space="preserve"> </w:t>
       </w:r>
-      <w:r>
+    </w:p>
+    <w:p>
+      <w:pPr>
+        <w:spacing w:before="100" w:beforeAutospacing="1" w:after="100" w:afterAutospacing="1" w:line="240" w:lineRule="auto"/>
+        <w:rPr>
+          <w:rFonts w:ascii="Times New Roman" w:eastAsia="Times New Roman" w:hAnsi="Times New Roman" w:cs="Times New Roman"/>
+          <w:sz w:val="24"/>
+          <w:szCs w:val="24"/>
+          <w:lang w:eastAsia="es-CO"/>
+        </w:rPr>
+      </w:pPr>
+      <w:r>
+        <w:rPr>
+          <w:rFonts w:ascii="Times New Roman" w:hAnsi="Times New Roman" w:cs="Times New Roman"/>
+          <w:sz w:val="24"/>
+          <w:szCs w:val="24"/>
+        </w:rPr>
         <w:t>Barranquilla tiene la brecha de ventas más amplia frente a Cali ($75,7 de diferencia). Redistribuir el inventario de los 3 productos top (Detergente en Polvo, Leche Entera y Arroz) hacia esa ciudad puede reducir la brecha sin incrementar costos globales.</w:t>
       </w:r>
     </w:p>
     <w:p>
       <w:pPr>
         <w:rPr>
+          <w:rFonts w:ascii="Times New Roman" w:hAnsi="Times New Roman" w:cs="Times New Roman"/>
           <w:b/>
           <w:bCs/>
-        </w:rPr>
-      </w:pPr>
-    </w:p>
-    <w:p>
-      <w:pPr>
-        <w:rPr>
+          <w:sz w:val="24"/>
+          <w:szCs w:val="24"/>
+        </w:rPr>
+      </w:pPr>
+    </w:p>
+    <w:p>
+      <w:pPr>
+        <w:rPr>
+          <w:rFonts w:ascii="Times New Roman" w:hAnsi="Times New Roman" w:cs="Times New Roman"/>
           <w:b/>
           <w:bCs/>
-        </w:rPr>
-      </w:pPr>
-    </w:p>
-    <w:p>
-      <w:pPr>
-        <w:rPr>
+          <w:sz w:val="24"/>
+          <w:szCs w:val="24"/>
+        </w:rPr>
+      </w:pPr>
+    </w:p>
+    <w:p>
+      <w:pPr>
+        <w:rPr>
+          <w:rFonts w:ascii="Times New Roman" w:hAnsi="Times New Roman" w:cs="Times New Roman"/>
           <w:b/>
           <w:bCs/>
-        </w:rPr>
-      </w:pPr>
-    </w:p>
-    <w:p>
-      <w:pPr>
-        <w:rPr>
+          <w:sz w:val="24"/>
+          <w:szCs w:val="24"/>
+        </w:rPr>
+      </w:pPr>
+    </w:p>
+    <w:p>
+      <w:pPr>
+        <w:rPr>
+          <w:rFonts w:ascii="Times New Roman" w:hAnsi="Times New Roman" w:cs="Times New Roman"/>
           <w:b/>
           <w:bCs/>
-        </w:rPr>
-      </w:pPr>
-      <w:r>
-        <w:rPr>
+          <w:sz w:val="24"/>
+          <w:szCs w:val="24"/>
+        </w:rPr>
+      </w:pPr>
+    </w:p>
+    <w:p>
+      <w:pPr>
+        <w:rPr>
+          <w:rFonts w:ascii="Times New Roman" w:hAnsi="Times New Roman" w:cs="Times New Roman"/>
           <w:b/>
           <w:bCs/>
-        </w:rPr>
-        <w:t xml:space="preserve">Abrir en </w:t>
-      </w:r>
-      <w:proofErr w:type="spellStart"/>
-      <w:r>
-        <w:rPr>
+          <w:sz w:val="24"/>
+          <w:szCs w:val="24"/>
+        </w:rPr>
+      </w:pPr>
+    </w:p>
+    <w:p>
+      <w:pPr>
+        <w:rPr>
+          <w:rFonts w:ascii="Times New Roman" w:hAnsi="Times New Roman" w:cs="Times New Roman"/>
           <w:b/>
           <w:bCs/>
-        </w:rPr>
-        <w:t>Colab</w:t>
-      </w:r>
-      <w:proofErr w:type="spellEnd"/>
-      <w:r>
-        <w:rPr>
+          <w:sz w:val="24"/>
+          <w:szCs w:val="24"/>
+        </w:rPr>
+      </w:pPr>
+      <w:r>
+        <w:rPr>
+          <w:rFonts w:ascii="Times New Roman" w:hAnsi="Times New Roman" w:cs="Times New Roman"/>
           <w:b/>
           <w:bCs/>
-        </w:rPr>
-        <w:t xml:space="preserve"> en caso de presentar problemas</w:t>
+          <w:sz w:val="24"/>
+          <w:szCs w:val="24"/>
+        </w:rPr>
+        <w:lastRenderedPageBreak/>
+        <w:t>Nota:</w:t>
+      </w:r>
+    </w:p>
+    <w:p>
+      <w:pPr>
+        <w:rPr>
+          <w:rFonts w:ascii="Times New Roman" w:hAnsi="Times New Roman" w:cs="Times New Roman"/>
+          <w:sz w:val="24"/>
+          <w:szCs w:val="24"/>
+        </w:rPr>
+      </w:pPr>
+      <w:r>
+        <w:rPr>
+          <w:rFonts w:ascii="Times New Roman" w:hAnsi="Times New Roman" w:cs="Times New Roman"/>
+          <w:sz w:val="24"/>
+          <w:szCs w:val="24"/>
+        </w:rPr>
+        <w:t>En caso de tener problemas con el archivo .</w:t>
+      </w:r>
+      <w:proofErr w:type="spellStart"/>
+      <w:r>
+        <w:rPr>
+          <w:rFonts w:ascii="Times New Roman" w:hAnsi="Times New Roman" w:cs="Times New Roman"/>
+          <w:sz w:val="24"/>
+          <w:szCs w:val="24"/>
+        </w:rPr>
+        <w:t>py</w:t>
+      </w:r>
+      <w:proofErr w:type="spellEnd"/>
+      <w:r>
+        <w:rPr>
+          <w:rFonts w:ascii="Times New Roman" w:hAnsi="Times New Roman" w:cs="Times New Roman"/>
+          <w:sz w:val="24"/>
+          <w:szCs w:val="24"/>
+        </w:rPr>
+        <w:t xml:space="preserve"> abrir en </w:t>
+      </w:r>
+      <w:proofErr w:type="spellStart"/>
+      <w:r>
+        <w:rPr>
+          <w:rFonts w:ascii="Times New Roman" w:hAnsi="Times New Roman" w:cs="Times New Roman"/>
+          <w:sz w:val="24"/>
+          <w:szCs w:val="24"/>
+        </w:rPr>
+        <w:t>colab</w:t>
+      </w:r>
+      <w:proofErr w:type="spellEnd"/>
+      <w:r>
+        <w:rPr>
+          <w:rFonts w:ascii="Times New Roman" w:hAnsi="Times New Roman" w:cs="Times New Roman"/>
+          <w:sz w:val="24"/>
+          <w:szCs w:val="24"/>
+        </w:rPr>
+        <w:t>. El link que muestra de manera interactiva lo desarrollado en Python lo dejamos a continuación:</w:t>
+      </w:r>
+    </w:p>
+    <w:p>
+      <w:pPr>
+        <w:rPr>
+          <w:rFonts w:ascii="Times New Roman" w:hAnsi="Times New Roman" w:cs="Times New Roman"/>
+          <w:sz w:val="24"/>
+          <w:szCs w:val="24"/>
+        </w:rPr>
+      </w:pPr>
+      <w:hyperlink r:id="rId7" w:history="1">
+        <w:r>
+          <w:rPr>
+            <w:rStyle w:val="Hipervnculo"/>
+            <w:rFonts w:ascii="Times New Roman" w:hAnsi="Times New Roman" w:cs="Times New Roman"/>
+            <w:sz w:val="24"/>
+            <w:szCs w:val="24"/>
+          </w:rPr>
+          <w:t>https://optimizacionempresarial-segmentacionclientes.streamlit.app/</w:t>
+        </w:r>
+      </w:hyperlink>
+      <w:r>
+        <w:rPr>
+          <w:rFonts w:ascii="Times New Roman" w:hAnsi="Times New Roman" w:cs="Times New Roman"/>
+          <w:sz w:val="24"/>
+          <w:szCs w:val="24"/>
+        </w:rPr>
+        <w:t xml:space="preserve"> </w:t>
       </w:r>
     </w:p>
     <w:sectPr>
@@ -721,6 +978,127 @@
     </w:p>
   </w:footnote>
 </w:footnotes>
+</file>
+
+<file path=word/numbering.xml><?xml version="1.0" encoding="utf-8"?>
+<w:numbering xmlns:wpc="http://schemas.microsoft.com/office/word/2010/wordprocessingCanvas" xmlns:cx="http://schemas.microsoft.com/office/drawing/2014/chartex" xmlns:cx1="http://schemas.microsoft.com/office/drawing/2015/9/8/chartex" xmlns:cx2="http://schemas.microsoft.com/office/drawing/2015/10/21/chartex" xmlns:cx3="http://schemas.microsoft.com/office/drawing/2016/5/9/chartex" xmlns:cx4="http://schemas.microsoft.com/office/drawing/2016/5/10/chartex" xmlns:cx5="http://schemas.microsoft.com/office/drawing/2016/5/11/chartex" xmlns:cx6="http://schemas.microsoft.com/office/drawing/2016/5/12/chartex" xmlns:cx7="http://schemas.microsoft.com/office/drawing/2016/5/13/chartex" xmlns:cx8="http://schemas.microsoft.com/office/drawing/2016/5/14/chartex" xmlns:mc="http://schemas.openxmlformats.org/markup-compatibility/2006" xmlns:aink="http://schemas.microsoft.com/office/drawing/2016/ink" xmlns:am3d="http://schemas.microsoft.com/office/drawing/2017/model3d" xmlns:o="urn:schemas-microsoft-com:office:office" xmlns:r="http://schemas.openxmlformats.org/officeDocument/2006/relationships" xmlns:m="http://schemas.openxmlformats.org/officeDocument/2006/math" xmlns:v="urn:schemas-microsoft-com:vml" xmlns:wp14="http://schemas.microsoft.com/office/word/2010/wordprocessingDrawing" xmlns:wp="http://schemas.openxmlformats.org/drawingml/2006/wordprocessingDrawing" xmlns:w10="urn:schemas-microsoft-com:office:word" xmlns:w="http://schemas.openxmlformats.org/wordprocessingml/2006/main" xmlns:w14="http://schemas.microsoft.com/office/word/2010/wordml" xmlns:w15="http://schemas.microsoft.com/office/word/2012/wordml" xmlns:w16cex="http://schemas.microsoft.com/office/word/2018/wordml/cex" xmlns:w16cid="http://schemas.microsoft.com/office/word/2016/wordml/cid" xmlns:w16="http://schemas.microsoft.com/office/word/2018/wordml" xmlns:w16sdtdh="http://schemas.microsoft.com/office/word/2020/wordml/sdtdatahash" xmlns:w16se="http://schemas.microsoft.com/office/word/2015/wordml/symex" xmlns:wpg="http://schemas.microsoft.com/office/word/2010/wordprocessingGroup" xmlns:wpi="http://schemas.microsoft.com/office/word/2010/wordprocessingInk" xmlns:wne="http://schemas.microsoft.com/office/word/2006/wordml" xmlns:wps="http://schemas.microsoft.com/office/word/2010/wordprocessingShape" mc:Ignorable="w14 w15 w16se w16cid w16 w16cex w16sdtdh wp14">
+  <w:abstractNum w:abstractNumId="0" w15:restartNumberingAfterBreak="0">
+    <w:nsid w:val="59B8312F"/>
+    <w:multiLevelType w:val="hybridMultilevel"/>
+    <w:tmpl w:val="186E789A"/>
+    <w:lvl w:ilvl="0" w:tplc="240A0001">
+      <w:start w:val="1"/>
+      <w:numFmt w:val="bullet"/>
+      <w:lvlText w:val=""/>
+      <w:lvlJc w:val="left"/>
+      <w:pPr>
+        <w:ind w:left="720" w:hanging="360"/>
+      </w:pPr>
+      <w:rPr>
+        <w:rFonts w:ascii="Symbol" w:hAnsi="Symbol" w:hint="default"/>
+      </w:rPr>
+    </w:lvl>
+    <w:lvl w:ilvl="1" w:tplc="240A0003" w:tentative="1">
+      <w:start w:val="1"/>
+      <w:numFmt w:val="bullet"/>
+      <w:lvlText w:val="o"/>
+      <w:lvlJc w:val="left"/>
+      <w:pPr>
+        <w:ind w:left="1440" w:hanging="360"/>
+      </w:pPr>
+      <w:rPr>
+        <w:rFonts w:ascii="Courier New" w:hAnsi="Courier New" w:cs="Courier New" w:hint="default"/>
+      </w:rPr>
+    </w:lvl>
+    <w:lvl w:ilvl="2" w:tplc="240A0005" w:tentative="1">
+      <w:start w:val="1"/>
+      <w:numFmt w:val="bullet"/>
+      <w:lvlText w:val=""/>
+      <w:lvlJc w:val="left"/>
+      <w:pPr>
+        <w:ind w:left="2160" w:hanging="360"/>
+      </w:pPr>
+      <w:rPr>
+        <w:rFonts w:ascii="Wingdings" w:hAnsi="Wingdings" w:hint="default"/>
+      </w:rPr>
+    </w:lvl>
+    <w:lvl w:ilvl="3" w:tplc="240A0001" w:tentative="1">
+      <w:start w:val="1"/>
+      <w:numFmt w:val="bullet"/>
+      <w:lvlText w:val=""/>
+      <w:lvlJc w:val="left"/>
+      <w:pPr>
+        <w:ind w:left="2880" w:hanging="360"/>
+      </w:pPr>
+      <w:rPr>
+        <w:rFonts w:ascii="Symbol" w:hAnsi="Symbol" w:hint="default"/>
+      </w:rPr>
+    </w:lvl>
+    <w:lvl w:ilvl="4" w:tplc="240A0003" w:tentative="1">
+      <w:start w:val="1"/>
+      <w:numFmt w:val="bullet"/>
+      <w:lvlText w:val="o"/>
+      <w:lvlJc w:val="left"/>
+      <w:pPr>
+        <w:ind w:left="3600" w:hanging="360"/>
+      </w:pPr>
+      <w:rPr>
+        <w:rFonts w:ascii="Courier New" w:hAnsi="Courier New" w:cs="Courier New" w:hint="default"/>
+      </w:rPr>
+    </w:lvl>
+    <w:lvl w:ilvl="5" w:tplc="240A0005" w:tentative="1">
+      <w:start w:val="1"/>
+      <w:numFmt w:val="bullet"/>
+      <w:lvlText w:val=""/>
+      <w:lvlJc w:val="left"/>
+      <w:pPr>
+        <w:ind w:left="4320" w:hanging="360"/>
+      </w:pPr>
+      <w:rPr>
+        <w:rFonts w:ascii="Wingdings" w:hAnsi="Wingdings" w:hint="default"/>
+      </w:rPr>
+    </w:lvl>
+    <w:lvl w:ilvl="6" w:tplc="240A0001" w:tentative="1">
+      <w:start w:val="1"/>
+      <w:numFmt w:val="bullet"/>
+      <w:lvlText w:val=""/>
+      <w:lvlJc w:val="left"/>
+      <w:pPr>
+        <w:ind w:left="5040" w:hanging="360"/>
+      </w:pPr>
+      <w:rPr>
+        <w:rFonts w:ascii="Symbol" w:hAnsi="Symbol" w:hint="default"/>
+      </w:rPr>
+    </w:lvl>
+    <w:lvl w:ilvl="7" w:tplc="240A0003" w:tentative="1">
+      <w:start w:val="1"/>
+      <w:numFmt w:val="bullet"/>
+      <w:lvlText w:val="o"/>
+      <w:lvlJc w:val="left"/>
+      <w:pPr>
+        <w:ind w:left="5760" w:hanging="360"/>
+      </w:pPr>
+      <w:rPr>
+        <w:rFonts w:ascii="Courier New" w:hAnsi="Courier New" w:cs="Courier New" w:hint="default"/>
+      </w:rPr>
+    </w:lvl>
+    <w:lvl w:ilvl="8" w:tplc="240A0005" w:tentative="1">
+      <w:start w:val="1"/>
+      <w:numFmt w:val="bullet"/>
+      <w:lvlText w:val=""/>
+      <w:lvlJc w:val="left"/>
+      <w:pPr>
+        <w:ind w:left="6480" w:hanging="360"/>
+      </w:pPr>
+      <w:rPr>
+        <w:rFonts w:ascii="Wingdings" w:hAnsi="Wingdings" w:hint="default"/>
+      </w:rPr>
+    </w:lvl>
+  </w:abstractNum>
+  <w:num w:numId="1">
+    <w:abstractNumId w:val="0"/>
+  </w:num>
+</w:numbering>
 </file>
 
 <file path=word/styles.xml><?xml version="1.0" encoding="utf-8"?>
@@ -1229,6 +1607,29 @@
     <w:uiPriority w:val="99"/>
     <w:rsid w:val="009150AB"/>
   </w:style>
+  <w:style w:type="character" w:styleId="Hipervnculo">
+    <w:name w:val="Hyperlink"/>
+    <w:basedOn w:val="Fuentedeprrafopredeter"/>
+    <w:uiPriority w:val="99"/>
+    <w:unhideWhenUsed/>
+    <w:rsid w:val="000E0FD8"/>
+    <w:rPr>
+      <w:color w:val="0563C1" w:themeColor="hyperlink"/>
+      <w:u w:val="single"/>
+    </w:rPr>
+  </w:style>
+  <w:style w:type="character" w:styleId="Mencinsinresolver">
+    <w:name w:val="Unresolved Mention"/>
+    <w:basedOn w:val="Fuentedeprrafopredeter"/>
+    <w:uiPriority w:val="99"/>
+    <w:semiHidden/>
+    <w:unhideWhenUsed/>
+    <w:rsid w:val="000E0FD8"/>
+    <w:rPr>
+      <w:color w:val="605E5C"/>
+      <w:shd w:val="clear" w:color="auto" w:fill="E1DFDD"/>
+    </w:rPr>
+  </w:style>
 </w:styles>
 </file>
 

</xml_diff>